<commit_message>
Actualizar practica20 con imagen de fondo y documento maestro
</commit_message>
<xml_diff>
--- a/docs/JCCP_Web_Practicas.docx
+++ b/docs/JCCP_Web_Practicas.docx
@@ -289,10 +289,7 @@
           </w:tcPr>
           <w:p>
             <w:r>
-              <w:t xml:space="preserve">Estas etiquetas definen la estructura básica </w:t>
-            </w:r>
-            <w:r>
-              <w:t>de todo documento HTML. El navegador solo muestra el contenido colocado dentro de &lt;</w:t>
+              <w:t>Estas etiquetas definen la estructura básica de todo documento HTML. El navegador solo muestra el contenido colocado dentro de &lt;</w:t>
             </w:r>
             <w:proofErr w:type="spellStart"/>
             <w:r>
@@ -552,10 +549,7 @@
               <w:spacing w:after="100"/>
             </w:pPr>
             <w:r>
-              <w:t>La etiqueta &lt;p&gt; separa el contenido en párrafos y agrega un espacio antes y después de cada uno. La eti</w:t>
-            </w:r>
-            <w:r>
-              <w:t>queta &lt;</w:t>
+              <w:t>La etiqueta &lt;p&gt; separa el contenido en párrafos y agrega un espacio antes y después de cada uno. La etiqueta &lt;</w:t>
             </w:r>
             <w:proofErr w:type="spellStart"/>
             <w:r>
@@ -808,10 +802,7 @@
             </w:r>
             <w:proofErr w:type="spellEnd"/>
             <w:r>
-              <w:t xml:space="preserve"> cambia la alineación horizontal del texto dentro del párrafo: a la izquierda, a la derecha, c</w:t>
-            </w:r>
-            <w:r>
-              <w:t>entrado, o justificado (alineado a ambos márgenes).</w:t>
+              <w:t xml:space="preserve"> cambia la alineación horizontal del texto dentro del párrafo: a la izquierda, a la derecha, centrado, o justificado (alineado a ambos márgenes).</w:t>
             </w:r>
           </w:p>
         </w:tc>
@@ -1413,10 +1404,7 @@
             </w:r>
             <w:proofErr w:type="spellEnd"/>
             <w:r>
-              <w:t>&gt; dibuja una línea horizontal que divide visualmente el contenido de la página</w:t>
-            </w:r>
-            <w:r>
-              <w:t xml:space="preserve">. El atributo </w:t>
+              <w:t xml:space="preserve">&gt; dibuja una línea horizontal que divide visualmente el contenido de la página. El atributo </w:t>
             </w:r>
             <w:proofErr w:type="spellStart"/>
             <w:r>
@@ -1677,10 +1665,7 @@
             </w:r>
             <w:proofErr w:type="spellEnd"/>
             <w:r>
-              <w:t xml:space="preserve"> elimina el efecto tridimensi</w:t>
-            </w:r>
-            <w:r>
-              <w:t>onal dejando la línea plana y sólida.</w:t>
+              <w:t xml:space="preserve"> elimina el efecto tridimensional dejando la línea plana y sólida.</w:t>
             </w:r>
           </w:p>
         </w:tc>
@@ -2133,10 +2118,7 @@
             </w:r>
             <w:proofErr w:type="spellStart"/>
             <w:r>
-              <w:t>stron</w:t>
-            </w:r>
-            <w:r>
-              <w:t>g</w:t>
+              <w:t>strong</w:t>
             </w:r>
             <w:proofErr w:type="spellEnd"/>
             <w:r>
@@ -2228,10 +2210,7 @@
       </w:r>
       <w:proofErr w:type="spellEnd"/>
       <w:r>
-        <w:t>="7</w:t>
-      </w:r>
-      <w:r>
-        <w:t>"&gt;</w:t>
+        <w:t>="7"&gt;</w:t>
       </w:r>
     </w:p>
     <w:p>
@@ -2697,13 +2676,7 @@
         <w:rPr>
           <w:lang w:val="en-US"/>
         </w:rPr>
-        <w:t>&lt;h3 align=</w:t>
-      </w:r>
-      <w:r>
-        <w:rPr>
-          <w:lang w:val="en-US"/>
-        </w:rPr>
-        <w:t>"left"&gt;, &lt;h4 align="right"&gt;, &lt;h5 align="center"&gt;, &lt;h6 align="justify"&gt;</w:t>
+        <w:t>&lt;h3 align="left"&gt;, &lt;h4 align="right"&gt;, &lt;h5 align="center"&gt;, &lt;h6 align="justify"&gt;</w:t>
       </w:r>
     </w:p>
     <w:p>
@@ -2911,10 +2884,7 @@
       </w:pPr>
       <w:r>
         <w:lastRenderedPageBreak/>
-        <w:t>Práctica 17</w:t>
-      </w:r>
-      <w:r>
-        <w:t xml:space="preserve"> - Marquesinas Básicas (&lt;MARQUEE&gt;)</w:t>
+        <w:t>Práctica 17 - Marquesinas Básicas (&lt;MARQUEE&gt;)</w:t>
       </w:r>
     </w:p>
     <w:p>
@@ -3080,13 +3050,7 @@
         <w:rPr>
           <w:lang w:val="en-US"/>
         </w:rPr>
-        <w:t>scrol</w:t>
-      </w:r>
-      <w:r>
-        <w:rPr>
-          <w:lang w:val="en-US"/>
-        </w:rPr>
-        <w:t>lamount</w:t>
+        <w:t>scrollamount</w:t>
       </w:r>
       <w:proofErr w:type="spellEnd"/>
       <w:r>
@@ -3309,10 +3273,7 @@
     </w:p>
     <w:p>
       <w:r>
-        <w:t>Captura</w:t>
-      </w:r>
-      <w:r>
-        <w:t>s de pantalla:</w:t>
+        <w:t>Capturas de pantalla:</w:t>
       </w:r>
     </w:p>
     <w:p>
@@ -3441,14 +3402,11 @@
     </w:p>
     <w:p>
       <w:r>
-        <w:rPr>
-          <w:noProof/>
-        </w:rPr>
         <w:drawing>
-          <wp:inline distT="0" distB="0" distL="0" distR="0" wp14:anchorId="597F9868" wp14:editId="23B4EF0D">
-            <wp:extent cx="5936615" cy="2620645"/>
-            <wp:effectExtent l="0" t="0" r="6985" b="8255"/>
-            <wp:docPr id="19" name="Imagen 19"/>
+          <wp:inline distT="0" distB="0" distL="0" distR="0" wp14:anchorId="00B7D003" wp14:editId="4193202D">
+            <wp:extent cx="5943600" cy="2574925"/>
+            <wp:effectExtent l="0" t="0" r="0" b="0"/>
+            <wp:docPr id="18" name="Imagen 18"/>
             <wp:cNvGraphicFramePr>
               <a:graphicFrameLocks xmlns:a="http://schemas.openxmlformats.org/drawingml/2006/main" noChangeAspect="1"/>
             </wp:cNvGraphicFramePr>
@@ -3456,36 +3414,62 @@
               <a:graphicData uri="http://schemas.openxmlformats.org/drawingml/2006/picture">
                 <pic:pic xmlns:pic="http://schemas.openxmlformats.org/drawingml/2006/picture">
                   <pic:nvPicPr>
-                    <pic:cNvPr id="0" name="Picture 1"/>
-                    <pic:cNvPicPr>
-                      <a:picLocks noChangeAspect="1" noChangeArrowheads="1"/>
-                    </pic:cNvPicPr>
+                    <pic:cNvPr id="1" name=""/>
+                    <pic:cNvPicPr/>
                   </pic:nvPicPr>
                   <pic:blipFill>
-                    <a:blip r:embed="rId30" cstate="print">
-                      <a:extLst>
-                        <a:ext uri="{28A0092B-C50C-407E-A947-70E740481C1C}">
-                          <a14:useLocalDpi xmlns:a14="http://schemas.microsoft.com/office/drawing/2010/main" val="0"/>
-                        </a:ext>
-                      </a:extLst>
-                    </a:blip>
-                    <a:srcRect/>
+                    <a:blip r:embed="rId30"/>
                     <a:stretch>
                       <a:fillRect/>
                     </a:stretch>
                   </pic:blipFill>
-                  <pic:spPr bwMode="auto">
+                  <pic:spPr>
                     <a:xfrm>
                       <a:off x="0" y="0"/>
-                      <a:ext cx="5936615" cy="2620645"/>
+                      <a:ext cx="5943600" cy="2574925"/>
                     </a:xfrm>
                     <a:prstGeom prst="rect">
                       <a:avLst/>
                     </a:prstGeom>
-                    <a:noFill/>
-                    <a:ln>
-                      <a:noFill/>
-                    </a:ln>
+                  </pic:spPr>
+                </pic:pic>
+              </a:graphicData>
+            </a:graphic>
+          </wp:inline>
+        </w:drawing>
+      </w:r>
+    </w:p>
+    <w:p>
+      <w:r>
+        <w:drawing>
+          <wp:inline distT="0" distB="0" distL="0" distR="0" wp14:anchorId="333BAA3F" wp14:editId="4A1CF278">
+            <wp:extent cx="5943600" cy="2802255"/>
+            <wp:effectExtent l="0" t="0" r="0" b="0"/>
+            <wp:docPr id="24" name="Imagen 24"/>
+            <wp:cNvGraphicFramePr>
+              <a:graphicFrameLocks xmlns:a="http://schemas.openxmlformats.org/drawingml/2006/main" noChangeAspect="1"/>
+            </wp:cNvGraphicFramePr>
+            <a:graphic xmlns:a="http://schemas.openxmlformats.org/drawingml/2006/main">
+              <a:graphicData uri="http://schemas.openxmlformats.org/drawingml/2006/picture">
+                <pic:pic xmlns:pic="http://schemas.openxmlformats.org/drawingml/2006/picture">
+                  <pic:nvPicPr>
+                    <pic:cNvPr id="1" name=""/>
+                    <pic:cNvPicPr/>
+                  </pic:nvPicPr>
+                  <pic:blipFill>
+                    <a:blip r:embed="rId31"/>
+                    <a:stretch>
+                      <a:fillRect/>
+                    </a:stretch>
+                  </pic:blipFill>
+                  <pic:spPr>
+                    <a:xfrm>
+                      <a:off x="0" y="0"/>
+                      <a:ext cx="5943600" cy="2802255"/>
+                    </a:xfrm>
+                    <a:prstGeom prst="rect">
+                      <a:avLst/>
+                    </a:prstGeom>
                   </pic:spPr>
                 </pic:pic>
               </a:graphicData>
@@ -3552,10 +3536,7 @@
             </w:r>
             <w:proofErr w:type="spellEnd"/>
             <w:r>
-              <w:t xml:space="preserve"> permite cam</w:t>
-            </w:r>
-            <w:r>
-              <w:t>biar el tamaño relativo o absoluto del texto en un rango de 1 a 7, así como con modificadores (+ o -), sin afectar el tamaño por defecto del documento.</w:t>
+              <w:t xml:space="preserve"> permite cambiar el tamaño relativo o absoluto del texto en un rango de 1 a 7, así como con modificadores (+ o -), sin afectar el tamaño por defecto del documento.</w:t>
             </w:r>
           </w:p>
         </w:tc>
@@ -3589,10 +3570,7 @@
             </w:r>
             <w:proofErr w:type="spellEnd"/>
             <w:r>
-              <w:t xml:space="preserve">&gt; permite </w:t>
-            </w:r>
-            <w:r>
-              <w:t xml:space="preserve">modificar el color del texto utilizando nombres predefinidos en inglés (como red o </w:t>
+              <w:t xml:space="preserve">&gt; permite modificar el color del texto utilizando nombres predefinidos en inglés (como red o </w:t>
             </w:r>
             <w:proofErr w:type="spellStart"/>
             <w:r>
@@ -3642,10 +3620,7 @@
             </w:r>
             <w:proofErr w:type="gramEnd"/>
             <w:r>
-              <w:t xml:space="preserve"> Arial, Times N</w:t>
-            </w:r>
-            <w:r>
-              <w:t xml:space="preserve">ew </w:t>
+              <w:t xml:space="preserve"> Arial, Times New </w:t>
             </w:r>
             <w:proofErr w:type="spellStart"/>
             <w:r>
@@ -3679,10 +3654,11 @@
           </w:tcPr>
           <w:p>
             <w:r>
-              <w:t>Las etiquetas de cabecera &lt;h1-h6&gt; estructuran jerárquicamente las se</w:t>
-            </w:r>
-            <w:r>
-              <w:t>cciones del documento, mostrándose en negrita de forma predeterminada, donde &lt;h1&gt; es el título principal de mayor tamaño y &lt;h6&gt; el menor.</w:t>
+              <w:t xml:space="preserve">Las etiquetas de cabecera &lt;h1-h6&gt; estructuran jerárquicamente las secciones del documento, </w:t>
+            </w:r>
+            <w:r>
+              <w:lastRenderedPageBreak/>
+              <w:t>mostrándose en negrita de forma predeterminada, donde &lt;h1&gt; es el título principal de mayor tamaño y &lt;h6&gt; el menor.</w:t>
             </w:r>
           </w:p>
         </w:tc>
@@ -3698,6 +3674,7 @@
               <w:rPr>
                 <w:b/>
               </w:rPr>
+              <w:lastRenderedPageBreak/>
               <w:t>Observaciones / Efecto de las etiquetas</w:t>
             </w:r>
           </w:p>
@@ -3716,10 +3693,7 @@
             </w:r>
             <w:proofErr w:type="spellEnd"/>
             <w:r>
-              <w:t xml:space="preserve"> permite modificar la orientación horizontal de los encabeza</w:t>
-            </w:r>
-            <w:r>
-              <w:t>dos (</w:t>
+              <w:t xml:space="preserve"> permite modificar la orientación horizontal de los encabezados (</w:t>
             </w:r>
             <w:proofErr w:type="spellStart"/>
             <w:r>
@@ -3777,10 +3751,7 @@
             </w:r>
             <w:proofErr w:type="spellEnd"/>
             <w:r>
-              <w:t>&gt; múltiples atributos (tamaño, tipo de fuente y color) para personalizar comp</w:t>
-            </w:r>
-            <w:r>
-              <w:t>letamente la apariencia de palabras o fragmentos de texto específicos.</w:t>
+              <w:t>&gt; múltiples atributos (tamaño, tipo de fuente y color) para personalizar completamente la apariencia de palabras o fragmentos de texto específicos.</w:t>
             </w:r>
           </w:p>
         </w:tc>
@@ -3830,13 +3801,7 @@
               <w:rPr>
                 <w:b/>
               </w:rPr>
-              <w:t>Observac</w:t>
-            </w:r>
-            <w:r>
-              <w:rPr>
-                <w:b/>
-              </w:rPr>
-              <w:t>iones / Efecto de las etiquetas</w:t>
+              <w:t>Observaciones / Efecto de las etiquetas</w:t>
             </w:r>
           </w:p>
         </w:tc>
@@ -3910,7 +3875,6 @@
               <w:rPr>
                 <w:b/>
               </w:rPr>
-              <w:lastRenderedPageBreak/>
               <w:t>Observaciones / Efecto de las etiquetas</w:t>
             </w:r>
           </w:p>
@@ -3953,13 +3917,7 @@
               <w:rPr>
                 <w:b/>
               </w:rPr>
-              <w:t>Observaciones / Efec</w:t>
-            </w:r>
-            <w:r>
-              <w:rPr>
-                <w:b/>
-              </w:rPr>
-              <w:t>to de las etiquetas</w:t>
+              <w:t>Observaciones / Efecto de las etiquetas</w:t>
             </w:r>
           </w:p>
         </w:tc>

</xml_diff>